<commit_message>
Update GOTO note with verified research findings
Reframe the Morgan Stanley block as the observed clearing level rather
than a defended floor (resold 7.4bn shares within two days), use the
1 Oct price of Rp28, and add cash coverage, implied 2H guidance, the
treasury-share ESOP point and regulatory-creep risk.

Co-Authored-By: Claude Opus 5.5 <noreply@anthropic.com>
Claude-Session: https://claude.ai/code/session_01NVE9ZSe7h9HPax981ZAb5b
</commit_message>
<xml_diff>
--- a/GOTO_Share_Price_Analysis.docx
+++ b/GOTO_Share_Price_Analysis.docx
@@ -16,91 +16,97 @@
         <w:jc w:val="both"/>
       </w:pPr>
       <w:r>
-        <w:t xml:space="preserve">GOTO’s recent share-price weakness has been driven by a combination of regulatory uncertainty and technical selling pressure. The distinction matters: only the regulatory change has a direct impact on earnings, while the technical selling was largely forced and price-insensitive, and therefore says little about the company’s fundamental value.</w:t>
-      </w:r>
-    </w:p>
-    <w:p>
-      <w:pPr>
-        <w:spacing w:after="160" w:line="288"/>
-        <w:jc w:val="both"/>
-      </w:pPr>
-      <w:r>
-        <w:t xml:space="preserve">The first major concern was the reduction in GoRide’s commission rate from 20% to 8% effective July 2026, a 60% cut in the take rate on every GoRide trip. Management acknowledged that GoRide becomes loss-making under the new structure and subsequently cut FY26 ODS adjusted EBITDA guidance by around Rp300bn to Rp1.4–1.5tn. The impact, however, needs to be kept in proportion. GoRide contributes only around 7% of Group net revenue, so even if GoRide revenue fell by the full 60% with no change in volumes, the hit would be roughly 4% of Group net revenue. Group adjusted EBITDA guidance was maintained at Rp3.2–3.4tn, as stronger Fintech profitability offsets the weaker ODS economics. Because the new rate only applies from July, the FY26 guidance cut captures roughly half a year; on a full-year basis the drag could be closer to Rp600bn before any mitigation, or around 18% of the Group EBITDA guidance midpoint. That is a meaningful hit, but it is well short of the 40–60% fall in the share price from the former Rp50 floor to the Rp20s.</w:t>
-      </w:r>
-    </w:p>
-    <w:p>
-      <w:pPr>
-        <w:spacing w:after="160" w:line="288"/>
-        <w:jc w:val="both"/>
-      </w:pPr>
-      <w:r>
-        <w:t xml:space="preserve">The second source of pressure was technical. MSCI removed GOTO from its Indonesia index at the end of August due to liquidity and replicability concerns while the stock was trapped at the Rp50 minimum price. Index-tracking funds must sell a deleted stock regardless of price or valuation, creating an estimated passive selling requirement of around Rp1tn, or roughly 20bn shares at Rp50. Because the stock was already at the minimum price, no bids could be placed below Rp50 on the regular market, so this supply could not clear normally and instead built up as an overhang.</w:t>
-      </w:r>
-    </w:p>
-    <w:p>
-      <w:pPr>
-        <w:spacing w:after="160" w:line="288"/>
-        <w:jc w:val="both"/>
-      </w:pPr>
-      <w:r>
-        <w:t xml:space="preserve">Around the same period, Morgan Stanley acquired approximately 21.7bn shares through negotiated-market transactions at around Rp25/share, a trade worth roughly Rp540bn. Three points stand out. </w:t>
-      </w:r>
-      <w:r>
-        <w:rPr>
-          <w:b/>
-          <w:bCs/>
-        </w:rPr>
-        <w:t xml:space="preserve">First, the volume.</w:t>
-      </w:r>
-      <w:r>
-        <w:t xml:space="preserve"> At 21.7bn shares, the block is almost identical to the estimated ~20bn shares of MSCI-related selling, which suggests it may have absorbed a large part of the passive supply, although this remains unconfirmed. </w:t>
-      </w:r>
-      <w:r>
-        <w:rPr>
-          <w:b/>
-          <w:bCs/>
-        </w:rPr>
-        <w:t xml:space="preserve">Second, the price.</w:t>
-      </w:r>
-      <w:r>
-        <w:t xml:space="preserve"> The block traded at half the regular-market floor. Sellers were willing to accept Rp25 to exit immediately rather than wait in the queue at Rp50, which showed that Rp50 was an artificial level and that the real clearing price for large volumes was much lower. </w:t>
-      </w:r>
-      <w:r>
-        <w:rPr>
-          <w:b/>
-          <w:bCs/>
-        </w:rPr>
-        <w:t xml:space="preserve">Third, the block sets a visible institutional entry price.</w:t>
-      </w:r>
-      <w:r>
-        <w:t xml:space="preserve"> Large institutions are generally reluctant to realise losses below their entry cost, both because of mark-to-market reporting and because selling below cost crystallises a loss on a position they have just built. Holders who bought around Rp25 therefore have little incentive to sell below that level. Other investors, in turn, may treat Rp25 as a reference point where sophisticated capital was willing to commit around Rp540bn, and step in to buy near the same price. Together, these effects can make the Rp25 area act as a support zone. This should not be overstated: Morgan Stanley may have acted on behalf of clients rather than for its own book, the position may be hedged, and any support level only holds if fundamentals do not deteriorate further.</w:t>
-      </w:r>
-    </w:p>
-    <w:p>
-      <w:pPr>
-        <w:spacing w:after="160" w:line="288"/>
-        <w:jc w:val="both"/>
-      </w:pPr>
-      <w:r>
-        <w:t xml:space="preserve">Finally, when IDX lowered the minimum share price from Rp50 to Rp1 on 28 September, selling that had previously been unable to clear below Rp50 was immediately released into the market, accelerating GOTO’s price discovery. The share price has since moved into the Rp20s, close to the level at which the Morgan Stanley block traded. This is consistent with the view that the negotiated-market price had already signalled where the market would clear once the floor was removed. Volatility is likely to stay elevated in the near term: at these levels IDX’s Rp1 minimum tick size means a single tick moves the share price by roughly 4–5%.</w:t>
-      </w:r>
-    </w:p>
-    <w:p>
-      <w:pPr>
-        <w:spacing w:after="160" w:line="288"/>
-        <w:jc w:val="both"/>
-      </w:pPr>
-      <w:r>
-        <w:t xml:space="preserve">Another catalyst that may have weakened sentiment is the fading optionality of a potential Grab–GOTO merger. On 15 September, Grab instead announced its largest cash acquisition to date, agreeing to acquire 60% of Atome Financial for US$1.49bn, implying an initial equity valuation of roughly US$2.5bn. Grab has also committed to acquiring the remaining 40% approximately two years after completion, with the eventual valuation subject to a US$2.0–4.5bn framework. This implies a further payment of roughly US$0.8–1.8bn and a total commitment of around US$2.3–3.3bn. This does not confirm that a Grab–GOTO transaction is cancelled. It does show that Grab’s near-term capital and management attention are being directed towards consumer finance through Atome rather than towards acquiring GOTO, reducing the strategic urgency of a deal.</w:t>
-      </w:r>
-    </w:p>
-    <w:p>
-      <w:pPr>
-        <w:spacing w:after="160" w:line="288"/>
-        <w:jc w:val="both"/>
-      </w:pPr>
-      <w:r>
-        <w:t xml:space="preserve">At the same time, any potential transaction remains exposed to government and regulatory considerations. Ride-hailing has increasingly been treated as a strategic sector, and the government has just shown, through the reduction of motorcycle ride-hailing commissions to 8%, that it is willing to intervene directly in industry economics. A merger combining the two largest platforms would likely face similar scrutiny over competition and over driver and consumer welfare. As a result, the market may be assigning less value to the previously anticipated M&amp;A optionality until there is greater clarity on both Grab’s strategic priorities and the government’s preferred structure for the industry.</w:t>
+        <w:t xml:space="preserve">GOTO has fallen 44%, from the Rp50 floor to Rp28 on 1 October. Two forces drove the fall: a regulatory cut to ride-hailing economics, and a chain of technical selling. The distinction matters. Only the regulation affects earnings. The technical selling was forced and insensitive to price, so it says little about what the business is worth.</w:t>
+      </w:r>
+    </w:p>
+    <w:p>
+      <w:pPr>
+        <w:spacing w:after="160" w:line="288"/>
+        <w:jc w:val="both"/>
+      </w:pPr>
+      <w:r>
+        <w:rPr>
+          <w:b/>
+          <w:bCs/>
+        </w:rPr>
+        <w:t xml:space="preserve">The regulatory hit is real but contained.</w:t>
+      </w:r>
+      <w:r>
+        <w:t xml:space="preserve"> Under Presidential Regulation 27/2026, GoRide's commission fell from 20% to 8% on 1 July, a 60% cut in take rate. Management says GoRide is now loss-making and cut FY26 On-Demand Services (ODS) adjusted EBITDA guidance by ~Rp300bn to Rp1.4–1.5tn. It raised Fintech guidance by the same Rp300bn, to Rp1.7–1.8tn, so Group guidance of Rp3.2–3.4tn is unchanged. GoRide is only ~7% of Group net revenue: even a full 60% revenue loss with flat volumes costs about 4% of Group revenue. The guidance cut covers only half a year, so the full-year drag could be nearer Rp600bn before mitigation, about 18% of Group EBITDA. That is meaningful, but well short of a 44% fall in the share price.</w:t>
+      </w:r>
+    </w:p>
+    <w:p>
+      <w:pPr>
+        <w:spacing w:after="160" w:line="288"/>
+        <w:jc w:val="both"/>
+      </w:pPr>
+      <w:r>
+        <w:rPr>
+          <w:b/>
+          <w:bCs/>
+        </w:rPr>
+        <w:t xml:space="preserve">Forced selling, step one: the MSCI deletion.</w:t>
+      </w:r>
+      <w:r>
+        <w:t xml:space="preserve"> MSCI announced on 13 August that it would delete GOTO, effective 31 August. Its reason was liquidity: the stock had been stuck at the Rp50 minimum price since mid-May. Index funds must sell regardless of price, and Mirae estimated outflows of up to Rp1tn (~20bn shares). With no bids allowed below Rp50, this supply could not clear. It queued instead: by 25 September about 39bn shares (~Rp2tn) were waiting to sell at Rp50, roughly double the MSCI estimate.</w:t>
+      </w:r>
+    </w:p>
+    <w:p>
+      <w:pPr>
+        <w:spacing w:after="160" w:line="288"/>
+        <w:jc w:val="both"/>
+      </w:pPr>
+      <w:r>
+        <w:rPr>
+          <w:b/>
+          <w:bCs/>
+        </w:rPr>
+        <w:t xml:space="preserve">Step two: the Morgan Stanley block, which reveals the clearing price rather than a support level.</w:t>
+      </w:r>
+      <w:r>
+        <w:t xml:space="preserve"> On 2 September, two days after the deletion took effect, Morgan Stanley bought 21.9bn shares at Rp25 in the negotiated market (~Rp548bn). The size is almost exactly the estimated index selling, which suggests it absorbed that supply. The price, half the Rp50 floor, showed the floor was artificial: large holders would accept Rp25 to get out. Morgan Stanley does not, however, behave like an anchor investor defending its cost. It already held 5.7%, typical of a custodian or broker holding shares for clients. It sold 7.4bn shares at Rp25–27 just two days later, and traded in a Rp25–29 band through 11 September. Analysts also note that a negotiated-market price is not a reference price for the regular market. The right reading is that </w:t>
+      </w:r>
+      <w:r>
+        <w:rPr>
+          <w:b/>
+          <w:bCs/>
+        </w:rPr>
+        <w:t xml:space="preserve">Rp25–29 is where large blocks have actually cleared</w:t>
+      </w:r>
+      <w:r>
+        <w:t xml:space="preserve">. That is useful evidence of value, but no one has an incentive to defend it as a floor.</w:t>
+      </w:r>
+    </w:p>
+    <w:p>
+      <w:pPr>
+        <w:spacing w:after="160" w:line="288"/>
+        <w:jc w:val="both"/>
+      </w:pPr>
+      <w:r>
+        <w:rPr>
+          <w:b/>
+          <w:bCs/>
+        </w:rPr>
+        <w:t xml:space="preserve">Step three: the floor was removed.</w:t>
+      </w:r>
+      <w:r>
+        <w:t xml:space="preserve"> On 28 September IDX cut the minimum price from Rp50 to Rp1, releasing the queued selling. GOTO hit its daily lower limit three days running (Rp43, Rp37, Rp32) and reached Rp28 on 1 October, inside the band where Morgan Stanley's blocks traded. Volatility will stay high: with a Rp1 tick, each price step is now 3–4% of the share price.</w:t>
+      </w:r>
+    </w:p>
+    <w:p>
+      <w:pPr>
+        <w:spacing w:after="160" w:line="288"/>
+        <w:jc w:val="both"/>
+      </w:pPr>
+      <w:r>
+        <w:rPr>
+          <w:b/>
+          <w:bCs/>
+        </w:rPr>
+        <w:t xml:space="preserve">The merger option was already fading; Grab–Atome confirms it.</w:t>
+      </w:r>
+      <w:r>
+        <w:t xml:space="preserve"> Grab–GOTO talks were reported called off in September 2025. On 15 September 2026 Grab agreed to buy 60% of Atome Financial for US$1.49bn and committed to buy the remaining 40% later at a US$2.0–4.5bn valuation, roughly US$2.3–3.3bn in total. Atome competes directly with GoPay Later. The deal points Grab's capital and attention elsewhere. Any merger would also face the competition regulator (KPPU), which has warned that a combined entity would control more than 90% of the market. The state fund Danantara is quietly building a stake of under 1% in GOTO, so the government is a shareholder as well as the regulator. The merger should be treated as a free option, not part of the thesis.</w:t>
       </w:r>
     </w:p>
     <w:p>
@@ -117,43 +123,87 @@
         <w:jc w:val="both"/>
       </w:pPr>
       <w:r>
-        <w:t xml:space="preserve">Despite these pressures, GOTO’s underlying operating performance remains on an improving trajectory. In 2Q26, Group Core GTV grew 83% YoY to Rp164tn, net revenue increased 31% YoY to Rp5.7tn, adjusted EBITDA rose 137% YoY to above Rp1.0tn, and GOTO recorded its second consecutive quarterly net profit. Annualised, 2Q26 adjusted EBITDA implies a run-rate of more than Rp4tn, above the FY26 guidance of Rp3.2–3.4tn. This suggests the maintained guidance leaves room to absorb GoRide’s losses in the second half.</w:t>
-      </w:r>
-    </w:p>
-    <w:p>
-      <w:pPr>
-        <w:spacing w:after="160" w:line="288"/>
-        <w:jc w:val="both"/>
-      </w:pPr>
-      <w:r>
-        <w:t xml:space="preserve">Financial Services has increasingly become the key growth engine. Fintech Core GTV reached Rp157tn in 2Q26, equivalent to approximately Rp630tn annualised, while total Fintech GTV reached Rp265tn, equivalent to more than Rp1,060tn annualised. Loans outstanding increased 58% YoY to Rp11tn and Fintech adjusted EBITDA reached Rp481bn. Annualised, Fintech EBITDA of roughly Rp1.9tn already exceeds the full-year ODS guidance of Rp1.4–1.5tn. In other words, the segment most exposed to the commission cut is no longer the largest driver of Group profitability, and its weight in the investment case shrinks with every quarter that Fintech grows. With the loan book expanding this quickly, asset quality becomes the key metric to monitor.</w:t>
-      </w:r>
-    </w:p>
-    <w:p>
-      <w:pPr>
-        <w:spacing w:after="160" w:line="288"/>
-        <w:jc w:val="both"/>
-      </w:pPr>
-      <w:r>
-        <w:t xml:space="preserve">This remains consistent with our long-term thesis that GOTO’s scale and network effects across Gojek, GoPay and Tokopedia can support continued transaction growth, deeper monetisation and improving profitability as the ecosystem matures. Our research values GOTO at Rp70–90/share based on these structural advantages. The company is also proposing to cancel more than 32bn treasury shares, or around 2.7% of issued shares, which would permanently reduce the share count if approved at the October EGMS. Because treasury shares are already excluded from the outstanding share count, the direct per-share effect is modest. Cancellation does, however, remove the possibility of the shares being reissued, and it signals capital discipline.</w:t>
-      </w:r>
-    </w:p>
-    <w:p>
-      <w:pPr>
-        <w:spacing w:after="160" w:line="288"/>
-        <w:jc w:val="both"/>
-      </w:pPr>
-      <w:r>
-        <w:t xml:space="preserve">At around Rp25, with roughly 1.15tn shares outstanding, GOTO’s market value is approximately Rp29tn. That is around 9x the midpoint of FY26 Group adjusted EBITDA guidance and around 7x the 2Q26 annualised run-rate, before taking net cash into account. Our Rp70–90/share valuation implies upside of roughly 180–260% from that level.</w:t>
-      </w:r>
-    </w:p>
-    <w:p>
-      <w:pPr>
-        <w:spacing w:after="160" w:line="288"/>
-        <w:jc w:val="both"/>
-      </w:pPr>
-      <w:r>
-        <w:t xml:space="preserve">Regulatory risk is clearly higher, and the potential Grab merger should no longer be treated as a core part of the thesis. The key question is whether the fundamental earnings impact justifies the size of the share-price correction. Our analysis suggests it does not. The full-year GoRide drag of around Rp600bn before mitigation compares with a 40–60% fall in the share price, and much of that fall was driven by forced, price-insensitive selling that should fade once the overhang is absorbed. If Fintech continues to scale, Group profitability improves and regulatory uncertainty stabilises, prices in the Rp20s would imply a substantially more attractive valuation relative to GOTO’s longer-term earnings potential.</w:t>
+        <w:rPr>
+          <w:b/>
+          <w:bCs/>
+        </w:rPr>
+        <w:t xml:space="preserve">The business keeps improving, and the earnings mix is shifting to Fintech.</w:t>
+      </w:r>
+      <w:r>
+        <w:t xml:space="preserve"> In 2Q26, Core GTV rose 83% to Rp164tn, net revenue 31% to Rp5.7tn, and adjusted EBITDA 137% to more than Rp1.0tn. Net profit was Rp252bn, the second profitable quarter in a row. Fintech EBITDA grew 447% to Rp481bn and overtook ODS for the first time; loans grew 58% to Rp11tn. On full-year guidance, Fintech (Rp1.7–1.8tn) now out-earns ODS (Rp1.4–1.5tn). The business hit by the cap is no longer the main profit engine, and its weight shrinks every quarter Fintech grows.</w:t>
+      </w:r>
+    </w:p>
+    <w:p>
+      <w:pPr>
+        <w:spacing w:after="160" w:line="288"/>
+        <w:jc w:val="both"/>
+      </w:pPr>
+      <w:r>
+        <w:rPr>
+          <w:b/>
+          <w:bCs/>
+        </w:rPr>
+        <w:t xml:space="preserve">The balance sheet backs the valuation.</w:t>
+      </w:r>
+      <w:r>
+        <w:t xml:space="preserve"> GOTO held Rp23.5tn of cash at June and generated Rp809bn of adjusted free cash flow in 2Q. At Rp28, its ~1.15tn shares are worth ~Rp32tn, so gross cash covers about 73% of the market value. The rest of the business is valued at under 3x FY26 EBITDA guidance, although borrowings and any customer funds must be deducted before relying on that figure. The company will also ask shareholders on 14 October to cancel 32.18bn treasury shares (2.7%) that had been earmarked for employee stock plans. That removes a planned source of future dilution.</w:t>
+      </w:r>
+    </w:p>
+    <w:p>
+      <w:pPr>
+        <w:spacing w:after="160" w:line="288"/>
+        <w:jc w:val="both"/>
+      </w:pPr>
+      <w:r>
+        <w:rPr>
+          <w:b/>
+          <w:bCs/>
+        </w:rPr>
+        <w:t xml:space="preserve">What could go wrong.</w:t>
+      </w:r>
+      <w:r>
+        <w:t xml:space="preserve"> First, regulation may spread. The 8% cap covers two-wheel rides </w:t>
+      </w:r>
+      <w:r>
+        <w:rPr>
+          <w:b/>
+          <w:bCs/>
+        </w:rPr>
+        <w:t xml:space="preserve">so far</w:t>
+      </w:r>
+      <w:r>
+        <w:t xml:space="preserve">, and ministers met in August to discuss food delivery. Extending it to GoCar, GoFood or GoSend would hit much larger businesses. Second, guidance implies a weaker second half. 1H26 EBITDA was Rp1.92tn, so the full-year range needs only Rp0.64–0.74tn a quarter in 2H, against more than Rp1.0tn in 2Q. Either guidance is conservative, or management expects a 30%+ drop as the cap bites. Third, Fintech faces tighter paylater rules from the financial regulator (OJK) and a Grab-funded Atome. Fourth, on earnings rather than cash, GOTO is not yet cheap: annualised 2Q net profit puts it at about 30x.</w:t>
+      </w:r>
+    </w:p>
+    <w:p>
+      <w:pPr>
+        <w:spacing w:after="160" w:line="288"/>
+        <w:jc w:val="both"/>
+      </w:pPr>
+      <w:r>
+        <w:rPr>
+          <w:b/>
+          <w:bCs/>
+        </w:rPr>
+        <w:t xml:space="preserve">Conclusion.</w:t>
+      </w:r>
+      <w:r>
+        <w:t xml:space="preserve"> We value GOTO at Rp70–90/share; the sell-side consensus is ~Rp75–79, with 24 Buy ratings and no Sell. Regulatory risk is clearly higher and the merger is no longer part of the thesis. Even so, a full-year GoRide drag of ~Rp600bn does not justify a 44% fall, especially when most of that fall was forced selling and cash covers three-quarters of the market value. The key test is 3Q26 results, the first full quarter under the cap. If ODS EBITDA holds above the level implied by guidance, Fintech keeps compounding and the cap stays limited to two-wheel rides, prices around Rp25–30 will look substantially undervalued against GOTO’s longer-term earnings.</w:t>
+      </w:r>
+    </w:p>
+    <w:p>
+      <w:pPr>
+        <w:spacing w:before="240"/>
+      </w:pPr>
+      <w:r>
+        <w:rPr>
+          <w:i/>
+          <w:iCs/>
+          <w:color w:val="595959"/>
+          <w:sz w:val="17"/>
+          <w:szCs w:val="17"/>
+        </w:rPr>
+        <w:t xml:space="preserve">Sources: GoTo releases and 2Q26 earnings call; Grab Form 6-K (SEC); MSCI via Reuters; Mirae Asset; IDX ownership disclosures via CNBC Indonesia, Kontan and Katadata; Bisnis Indonesia; Jakarta Globe. Prices as of 1 October 2026. Not investment advice.</w:t>
       </w:r>
     </w:p>
     <w:sectPr>

</xml_diff>